<commit_message>
Activar filtro Tipo de Programa reactivo para todos los KPIs, Diagrama de Venn, gráficos y tablas del dashboard
</commit_message>
<xml_diff>
--- a/Especificacion_Tecnica_Modelo_CPGI_SIIS.docx
+++ b/Especificacion_Tecnica_Modelo_CPGI_SIIS.docx
@@ -114,454 +114,6 @@
           <w:szCs w:val="24"/>
         </w:rPr>
       </w:pPr>
-      <w:r>
-        <w:rPr>
-          <w:rFonts w:ascii="Times New Roman" w:hAnsi="Times New Roman" w:cs="Times New Roman"/>
-          <w:sz w:val="24"/>
-          <w:szCs w:val="24"/>
-        </w:rPr>
-        <w:t>La CPGI es un indicador continuo que estima la capacidad economica del hogar utilizando exclusivamente informacion de registros de bases administrativas integradas en el SIIS (ANSES, ARCA ex-AFIP, STESS, SINTyS, RASE, SENAF). En lugar de requerir auto-reportes de ingresos mensuales de encuestas, el modelo evalua atributos estructurales del hogar y de sus integrantes.</w:t>
-      </w:r>
-    </w:p>
-    <w:p>
-      <w:pPr>
-        <w:spacing w:before="240" w:after="200"/>
-        <w:jc w:val="both"/>
-        <w:rPr>
-          <w:rFonts w:ascii="Times New Roman" w:hAnsi="Times New Roman" w:cs="Times New Roman"/>
-          <w:b/>
-          <w:sz w:val="24"/>
-          <w:szCs w:val="24"/>
-        </w:rPr>
-      </w:pPr>
-      <w:r>
-        <w:rPr>
-          <w:rFonts w:ascii="Times New Roman" w:hAnsi="Times New Roman" w:cs="Times New Roman"/>
-          <w:b/>
-          <w:sz w:val="24"/>
-          <w:szCs w:val="24"/>
-        </w:rPr>
-        <w:t>1.2 Umbral de Corte y Clasificacion Binaria</w:t>
-      </w:r>
-    </w:p>
-    <w:p>
-      <w:pPr>
-        <w:spacing w:before="240" w:after="200"/>
-        <w:jc w:val="both"/>
-        <w:rPr>
-          <w:rFonts w:ascii="Times New Roman" w:hAnsi="Times New Roman" w:cs="Times New Roman"/>
-          <w:sz w:val="24"/>
-          <w:szCs w:val="24"/>
-        </w:rPr>
-      </w:pPr>
-      <w:r>
-        <w:rPr>
-          <w:rFonts w:ascii="Times New Roman" w:hAnsi="Times New Roman" w:cs="Times New Roman"/>
-          <w:sz w:val="24"/>
-          <w:szCs w:val="24"/>
-        </w:rPr>
-        <w:t>El cociente CPGI expresa la relacion entre la capacidad de ingreso estimada del hogar y la Canasta Basica Total (CBT) regionalizada:</w:t>
-      </w:r>
-    </w:p>
-    <w:p>
-      <w:pPr>
-        <w:spacing w:before="240" w:after="200"/>
-        <w:jc w:val="both"/>
-        <w:rPr>
-          <w:rFonts w:ascii="Times New Roman" w:hAnsi="Times New Roman" w:cs="Times New Roman"/>
-          <w:sz w:val="24"/>
-          <w:szCs w:val="24"/>
-        </w:rPr>
-      </w:pPr>
-      <w:r>
-        <w:rPr>
-          <w:rFonts w:ascii="Times New Roman" w:hAnsi="Times New Roman" w:cs="Times New Roman"/>
-          <w:sz w:val="24"/>
-          <w:szCs w:val="24"/>
-        </w:rPr>
-        <w:t>- Hogar Pobre (Linea de Pobreza LP): CPGI &lt; 1.00 (El ingreso potencial no cubre la CBT).</w:t>
-      </w:r>
-    </w:p>
-    <w:p>
-      <w:pPr>
-        <w:spacing w:before="240" w:after="200"/>
-        <w:jc w:val="both"/>
-        <w:rPr>
-          <w:rFonts w:ascii="Times New Roman" w:hAnsi="Times New Roman" w:cs="Times New Roman"/>
-          <w:sz w:val="24"/>
-          <w:szCs w:val="24"/>
-        </w:rPr>
-      </w:pPr>
-      <w:r>
-        <w:rPr>
-          <w:rFonts w:ascii="Times New Roman" w:hAnsi="Times New Roman" w:cs="Times New Roman"/>
-          <w:sz w:val="24"/>
-          <w:szCs w:val="24"/>
-        </w:rPr>
-        <w:t>- Hogar No Pobre: CPGI &gt;= 1.00 (El ingreso potencial iguala o supera la CBT).</w:t>
-      </w:r>
-    </w:p>
-    <w:p>
-      <w:pPr>
-        <w:spacing w:before="240" w:after="320"/>
-        <w:jc w:val="both"/>
-        <w:rPr>
-          <w:rFonts w:ascii="Times New Roman" w:hAnsi="Times New Roman" w:cs="Times New Roman"/>
-          <w:sz w:val="24"/>
-          <w:szCs w:val="24"/>
-        </w:rPr>
-      </w:pPr>
-      <w:r>
-        <w:rPr>
-          <w:rFonts w:ascii="Times New Roman" w:hAnsi="Times New Roman" w:cs="Times New Roman"/>
-          <w:sz w:val="24"/>
-          <w:szCs w:val="24"/>
-        </w:rPr>
-        <w:t>- Tasa de Vulnerabilidad Hogares (%) = (Hogares con CPGI &lt; 1.00 / Total Hogares Bases SIIS) x 100</w:t>
-      </w:r>
-    </w:p>
-    <w:p>
-      <w:pPr>
-        <w:spacing w:before="280" w:after="200"/>
-        <w:jc w:val="both"/>
-        <w:rPr>
-          <w:rFonts w:ascii="Times New Roman" w:hAnsi="Times New Roman" w:cs="Times New Roman"/>
-          <w:b/>
-          <w:sz w:val="24"/>
-          <w:szCs w:val="24"/>
-        </w:rPr>
-      </w:pPr>
-      <w:r>
-        <w:rPr>
-          <w:rFonts w:ascii="Times New Roman" w:hAnsi="Times New Roman" w:cs="Times New Roman"/>
-          <w:b/>
-          <w:sz w:val="24"/>
-          <w:szCs w:val="24"/>
-        </w:rPr>
-        <w:t>SECCION 2: Ecuacion Matematica Ajustada a Bases Administrativas SIIS</w:t>
-      </w:r>
-    </w:p>
-    <w:p>
-      <w:pPr>
-        <w:spacing w:before="280" w:after="200"/>
-        <w:jc w:val="both"/>
-        <w:rPr>
-          <w:rFonts w:ascii="Times New Roman" w:hAnsi="Times New Roman" w:cs="Times New Roman"/>
-          <w:b/>
-          <w:sz w:val="24"/>
-          <w:szCs w:val="24"/>
-        </w:rPr>
-      </w:pPr>
-      <w:r>
-        <w:rPr>
-          <w:rFonts w:ascii="Times New Roman" w:hAnsi="Times New Roman" w:cs="Times New Roman"/>
-          <w:b/>
-          <w:sz w:val="24"/>
-          <w:szCs w:val="24"/>
-        </w:rPr>
-        <w:t>2.1 Ecuacion Predictiva (MCO + Lasso)</w:t>
-      </w:r>
-    </w:p>
-    <w:p>
-      <w:pPr>
-        <w:spacing w:before="280" w:after="200"/>
-        <w:jc w:val="both"/>
-        <w:rPr>
-          <w:rFonts w:ascii="Times New Roman" w:hAnsi="Times New Roman" w:cs="Times New Roman"/>
-          <w:sz w:val="24"/>
-          <w:szCs w:val="24"/>
-        </w:rPr>
-      </w:pPr>
-      <w:r>
-        <w:rPr>
-          <w:rFonts w:ascii="Times New Roman" w:hAnsi="Times New Roman" w:cs="Times New Roman"/>
-          <w:sz w:val="24"/>
-          <w:szCs w:val="24"/>
-        </w:rPr>
-        <w:t>ln(CPGI) = b0 + b1*(Cant_personas) + b2*(Jefa_mujer_menores) + b3*(Jubilados_pensionados) + b4*(Sin_Patrimonio_SINTYS) + b5*(Cat_Monotributo_ARCA) + b6*(Tasa_dependencia) + b7*(Tasa_menores) + b8*(Monto_Adicional_ANSES) + b9*(Asalariados_registrados) + b10*(Clima_educativo^2) + b11*(Jefe_superior_completo) + b12*(Edad_jefe) + b13*(Ingreso_real_medio_provincial)</w:t>
-      </w:r>
-    </w:p>
-    <w:p>
-      <w:pPr>
-        <w:spacing w:before="280" w:after="200"/>
-        <w:jc w:val="both"/>
-        <w:rPr>
-          <w:rFonts w:ascii="Times New Roman" w:hAnsi="Times New Roman" w:cs="Times New Roman"/>
-          <w:b/>
-          <w:sz w:val="24"/>
-          <w:szCs w:val="24"/>
-        </w:rPr>
-      </w:pPr>
-      <w:r>
-        <w:rPr>
-          <w:rFonts w:ascii="Times New Roman" w:hAnsi="Times New Roman" w:cs="Times New Roman"/>
-          <w:b/>
-          <w:sz w:val="24"/>
-          <w:szCs w:val="24"/>
-        </w:rPr>
-        <w:t>2.2 Sustitucion de Variables de Vivienda EPH por Registros Administrativos</w:t>
-      </w:r>
-    </w:p>
-    <w:p>
-      <w:pPr>
-        <w:spacing w:before="280" w:after="200"/>
-        <w:jc w:val="both"/>
-        <w:rPr>
-          <w:rFonts w:ascii="Times New Roman" w:hAnsi="Times New Roman" w:cs="Times New Roman"/>
-          <w:sz w:val="24"/>
-          <w:szCs w:val="24"/>
-        </w:rPr>
-      </w:pPr>
-      <w:r>
-        <w:rPr>
-          <w:rFonts w:ascii="Times New Roman" w:hAnsi="Times New Roman" w:cs="Times New Roman"/>
-          <w:sz w:val="24"/>
-          <w:szCs w:val="24"/>
-        </w:rPr>
-        <w:t>Para operar 100% con bases administrativas sin dependencia de encuestas EPH, se removieron las variables habitacionales (Saneamiento_deficiente, Tenencia_regular, Piso_precario, Techo_precario) y se incorporaron tres variables de registros administrativos SIIS:</w:t>
-      </w:r>
-    </w:p>
-    <w:p>
-      <w:pPr>
-        <w:spacing w:before="280" w:after="200"/>
-        <w:jc w:val="both"/>
-        <w:rPr>
-          <w:rFonts w:ascii="Times New Roman" w:hAnsi="Times New Roman" w:cs="Times New Roman"/>
-          <w:sz w:val="24"/>
-          <w:szCs w:val="24"/>
-        </w:rPr>
-      </w:pPr>
-      <w:r>
-        <w:rPr>
-          <w:rFonts w:ascii="Times New Roman" w:hAnsi="Times New Roman" w:cs="Times New Roman"/>
-          <w:sz w:val="24"/>
-          <w:szCs w:val="24"/>
-        </w:rPr>
-        <w:t>1. Sin_Patrimonio_SINTYS (SINTyS): Ausencia de bienes registrables (inmuebles y automotores 0 a 3 anos de antiguedad).</w:t>
-      </w:r>
-    </w:p>
-    <w:p>
-      <w:pPr>
-        <w:spacing w:before="280" w:after="200"/>
-        <w:jc w:val="both"/>
-        <w:rPr>
-          <w:rFonts w:ascii="Times New Roman" w:hAnsi="Times New Roman" w:cs="Times New Roman"/>
-          <w:sz w:val="24"/>
-          <w:szCs w:val="24"/>
-        </w:rPr>
-      </w:pPr>
-      <w:r>
-        <w:rPr>
-          <w:rFonts w:ascii="Times New Roman" w:hAnsi="Times New Roman" w:cs="Times New Roman"/>
-          <w:sz w:val="24"/>
-          <w:szCs w:val="24"/>
-        </w:rPr>
-        <w:t>2. Cat_Monotributo_ARCA (ARCA): Categoria contributiva del monotributista (A a L) o regimen de autonomos.</w:t>
-      </w:r>
-    </w:p>
-    <w:p>
-      <w:pPr>
-        <w:spacing w:before="280" w:after="320"/>
-        <w:jc w:val="both"/>
-        <w:rPr>
-          <w:rFonts w:ascii="Times New Roman" w:hAnsi="Times New Roman" w:cs="Times New Roman"/>
-          <w:sz w:val="24"/>
-          <w:szCs w:val="24"/>
-        </w:rPr>
-      </w:pPr>
-      <w:r>
-        <w:rPr>
-          <w:rFonts w:ascii="Times New Roman" w:hAnsi="Times New Roman" w:cs="Times New Roman"/>
-          <w:sz w:val="24"/>
-          <w:szCs w:val="24"/>
-        </w:rPr>
-        <w:lastRenderedPageBreak/>
-        <w:t>3. Monto_Adicional_ANSES (ANSES): Adicionales liquidados por prestaciones de AUH/AUD o Asignaciones Familiares (Monto_Adicional_Vl).</w:t>
-      </w:r>
-    </w:p>
-    <w:p>
-      <w:pPr>
-        <w:spacing w:before="280" w:after="200"/>
-        <w:jc w:val="both"/>
-        <w:rPr>
-          <w:rFonts w:ascii="Times New Roman" w:hAnsi="Times New Roman" w:cs="Times New Roman"/>
-          <w:b/>
-          <w:sz w:val="24"/>
-          <w:szCs w:val="24"/>
-        </w:rPr>
-      </w:pPr>
-      <w:r>
-        <w:rPr>
-          <w:rFonts w:ascii="Times New Roman" w:hAnsi="Times New Roman" w:cs="Times New Roman"/>
-          <w:b/>
-          <w:sz w:val="24"/>
-          <w:szCs w:val="24"/>
-        </w:rPr>
-        <w:t>SECCION 3: Calculo Paso a Paso y Simulacion de Casos Ficticios</w:t>
-      </w:r>
-    </w:p>
-    <w:p>
-      <w:pPr>
-        <w:spacing w:before="280" w:after="200"/>
-        <w:jc w:val="both"/>
-        <w:rPr>
-          <w:rFonts w:ascii="Times New Roman" w:hAnsi="Times New Roman" w:cs="Times New Roman"/>
-          <w:sz w:val="24"/>
-          <w:szCs w:val="24"/>
-        </w:rPr>
-      </w:pPr>
-      <w:r>
-        <w:rPr>
-          <w:rFonts w:ascii="Times New Roman" w:hAnsi="Times New Roman" w:cs="Times New Roman"/>
-          <w:sz w:val="24"/>
-          <w:szCs w:val="24"/>
-        </w:rPr>
-        <w:t>Parametros de Ejemplo Calibrados:</w:t>
-      </w:r>
-    </w:p>
-    <w:p>
-      <w:pPr>
-        <w:spacing w:before="280" w:after="200"/>
-        <w:jc w:val="both"/>
-        <w:rPr>
-          <w:rFonts w:ascii="Times New Roman" w:hAnsi="Times New Roman" w:cs="Times New Roman"/>
-          <w:sz w:val="24"/>
-          <w:szCs w:val="24"/>
-        </w:rPr>
-      </w:pPr>
-      <w:r>
-        <w:rPr>
-          <w:rFonts w:ascii="Times New Roman" w:hAnsi="Times New Roman" w:cs="Times New Roman"/>
-          <w:sz w:val="24"/>
-          <w:szCs w:val="24"/>
-        </w:rPr>
-        <w:t>b0 = -0.35 | b1 = -0.08 | b2 = -0.25 | b3 = +0.20 | b4 = -0.15 | b5 = +0.05 | b6 = -0.15 | b7 = -0.10 | b8 = +0.12 | b9 = +0.35 | b10 = +0.002 | b11 = +0.30 | b12 = +0.005</w:t>
-      </w:r>
-    </w:p>
-    <w:p>
-      <w:pPr>
-        <w:spacing w:before="280" w:after="200"/>
-        <w:jc w:val="both"/>
-        <w:rPr>
-          <w:rFonts w:ascii="Times New Roman" w:hAnsi="Times New Roman" w:cs="Times New Roman"/>
-          <w:sz w:val="24"/>
-          <w:szCs w:val="24"/>
-        </w:rPr>
-      </w:pPr>
-      <w:r>
-        <w:rPr>
-          <w:rFonts w:ascii="Times New Roman" w:hAnsi="Times New Roman" w:cs="Times New Roman"/>
-          <w:sz w:val="24"/>
-          <w:szCs w:val="24"/>
-        </w:rPr>
-        <w:t>CASO A: Hogar en Indigencia Extrema</w:t>
-      </w:r>
-    </w:p>
-    <w:p>
-      <w:pPr>
-        <w:spacing w:before="280" w:after="200"/>
-        <w:jc w:val="both"/>
-        <w:rPr>
-          <w:rFonts w:ascii="Times New Roman" w:hAnsi="Times New Roman" w:cs="Times New Roman"/>
-          <w:sz w:val="24"/>
-          <w:szCs w:val="24"/>
-        </w:rPr>
-      </w:pPr>
-      <w:r>
-        <w:rPr>
-          <w:rFonts w:ascii="Times New Roman" w:hAnsi="Times New Roman" w:cs="Times New Roman"/>
-          <w:sz w:val="24"/>
-          <w:szCs w:val="24"/>
-        </w:rPr>
-        <w:t>- Madre soltera (32 anos) con 3 hijos (4 integrantes en La Matanza). Sin empleo registrado en ARCA/STESS. Cobrando AUH + Adicional en ANSES. Sin bienes en SINTyS. Clima educativo de 8 anos.</w:t>
-      </w:r>
-    </w:p>
-    <w:p>
-      <w:pPr>
-        <w:spacing w:before="280" w:after="200"/>
-        <w:jc w:val="both"/>
-        <w:rPr>
-          <w:rFonts w:ascii="Times New Roman" w:hAnsi="Times New Roman" w:cs="Times New Roman"/>
-          <w:sz w:val="24"/>
-          <w:szCs w:val="24"/>
-        </w:rPr>
-      </w:pPr>
-      <w:r>
-        <w:rPr>
-          <w:rFonts w:ascii="Times New Roman" w:hAnsi="Times New Roman" w:cs="Times New Roman"/>
-          <w:sz w:val="24"/>
-          <w:szCs w:val="24"/>
-        </w:rPr>
-        <w:t>Calculo:</w:t>
-      </w:r>
-    </w:p>
-    <w:p>
-      <w:pPr>
-        <w:spacing w:before="280" w:after="200"/>
-        <w:jc w:val="both"/>
-        <w:rPr>
-          <w:rFonts w:ascii="Times New Roman" w:hAnsi="Times New Roman" w:cs="Times New Roman"/>
-          <w:sz w:val="24"/>
-          <w:szCs w:val="24"/>
-        </w:rPr>
-      </w:pPr>
-      <w:r>
-        <w:rPr>
-          <w:rFonts w:ascii="Times New Roman" w:hAnsi="Times New Roman" w:cs="Times New Roman"/>
-          <w:sz w:val="24"/>
-          <w:szCs w:val="24"/>
-        </w:rPr>
-        <w:t>ln(CPGI) = -0.35 - 0.32 - 0.25 - 0.15 - 0.11 - 0.08 + 0.12 + 0.13 + 0.16 = -0.85</w:t>
-      </w:r>
-    </w:p>
-    <w:p>
-      <w:pPr>
-        <w:spacing w:before="280" w:after="200"/>
-        <w:jc w:val="both"/>
-        <w:rPr>
-          <w:rFonts w:ascii="Times New Roman" w:hAnsi="Times New Roman" w:cs="Times New Roman"/>
-          <w:sz w:val="24"/>
-          <w:szCs w:val="24"/>
-        </w:rPr>
-      </w:pPr>
-      <w:r>
-        <w:rPr>
-          <w:rFonts w:ascii="Times New Roman" w:hAnsi="Times New Roman" w:cs="Times New Roman"/>
-          <w:sz w:val="24"/>
-          <w:szCs w:val="24"/>
-        </w:rPr>
-        <w:t>CPGI = exp(-0.85) = 0.43</w:t>
-      </w:r>
-    </w:p>
-    <w:p>
-      <w:pPr>
-        <w:spacing w:before="280" w:after="200"/>
-        <w:jc w:val="both"/>
-        <w:rPr>
-          <w:rFonts w:ascii="Times New Roman" w:hAnsi="Times New Roman" w:cs="Times New Roman"/>
-          <w:sz w:val="24"/>
-          <w:szCs w:val="24"/>
-        </w:rPr>
-      </w:pPr>
-      <w:r>
-        <w:rPr>
-          <w:rFonts w:ascii="Times New Roman" w:hAnsi="Times New Roman" w:cs="Times New Roman"/>
-          <w:sz w:val="24"/>
-          <w:szCs w:val="24"/>
-        </w:rPr>
-        <w:t>Resultado Caso A: CPGI = 0.43 (&lt; 1.00). El ingreso potencial del hogar solo cubre el 43% de la Canasta Basica Total (CBT), clasificando como Indigencia Extrema.</w:t>
-      </w:r>
-    </w:p>
-    <w:p>
-      <w:pPr>
-        <w:spacing w:before="280" w:after="200"/>
-        <w:jc w:val="both"/>
-        <w:rPr>
-          <w:rFonts w:ascii="Times New Roman" w:hAnsi="Times New Roman" w:cs="Times New Roman"/>
-          <w:sz w:val="24"/>
-          <w:szCs w:val="24"/>
-        </w:rPr>
-      </w:pPr>
       <w:bookmarkStart w:id="0" w:name="_GoBack"/>
       <w:bookmarkEnd w:id="0"/>
       <w:r>
@@ -570,7 +122,679 @@
           <w:sz w:val="24"/>
           <w:szCs w:val="24"/>
         </w:rPr>
-        <w:t>CASO B: Hogar Formal Estabilizado</w:t>
+        <w:t>La CPGI es un indicador continuo que estima la capacidad economica del hogar utilizando exclusivamente informacion de registros de bases administrativas integradas en el SIIS (ANSES, ARCA ex-AFIP, STESS, SINTyS, RASE, SENAF). En lugar de requerir auto-reportes de ingresos mensuales de encuestas, el modelo evalua atributos estructurales del hogar y de sus integrantes.</w:t>
+      </w:r>
+    </w:p>
+    <w:p>
+      <w:pPr>
+        <w:spacing w:before="240" w:after="200"/>
+        <w:jc w:val="both"/>
+        <w:rPr>
+          <w:rFonts w:ascii="Times New Roman" w:hAnsi="Times New Roman" w:cs="Times New Roman"/>
+          <w:b/>
+          <w:sz w:val="24"/>
+          <w:szCs w:val="24"/>
+        </w:rPr>
+      </w:pPr>
+      <w:r>
+        <w:rPr>
+          <w:rFonts w:ascii="Times New Roman" w:hAnsi="Times New Roman" w:cs="Times New Roman"/>
+          <w:b/>
+          <w:sz w:val="24"/>
+          <w:szCs w:val="24"/>
+        </w:rPr>
+        <w:t>1.2 Umbral de Corte y Clasificacion Binaria</w:t>
+      </w:r>
+    </w:p>
+    <w:p>
+      <w:pPr>
+        <w:spacing w:before="240" w:after="200"/>
+        <w:jc w:val="both"/>
+        <w:rPr>
+          <w:rFonts w:ascii="Times New Roman" w:hAnsi="Times New Roman" w:cs="Times New Roman"/>
+          <w:sz w:val="24"/>
+          <w:szCs w:val="24"/>
+        </w:rPr>
+      </w:pPr>
+      <w:r>
+        <w:rPr>
+          <w:rFonts w:ascii="Times New Roman" w:hAnsi="Times New Roman" w:cs="Times New Roman"/>
+          <w:sz w:val="24"/>
+          <w:szCs w:val="24"/>
+        </w:rPr>
+        <w:t xml:space="preserve">El cociente </w:t>
+      </w:r>
+      <w:r>
+        <w:rPr>
+          <w:rFonts w:ascii="Times New Roman" w:hAnsi="Times New Roman" w:cs="Times New Roman"/>
+          <w:sz w:val="24"/>
+          <w:szCs w:val="24"/>
+        </w:rPr>
+        <w:t>CPGI expresa la relació</w:t>
+      </w:r>
+      <w:r>
+        <w:rPr>
+          <w:rFonts w:ascii="Times New Roman" w:hAnsi="Times New Roman" w:cs="Times New Roman"/>
+          <w:sz w:val="24"/>
+          <w:szCs w:val="24"/>
+        </w:rPr>
+        <w:t>n entre la capacidad de ingreso estimada del hogar y la Canasta Basica Total (CBT) regionalizada:</w:t>
+      </w:r>
+    </w:p>
+    <w:p>
+      <w:pPr>
+        <w:spacing w:before="240" w:after="200"/>
+        <w:jc w:val="both"/>
+        <w:rPr>
+          <w:rFonts w:ascii="Times New Roman" w:hAnsi="Times New Roman" w:cs="Times New Roman"/>
+          <w:sz w:val="24"/>
+          <w:szCs w:val="24"/>
+        </w:rPr>
+      </w:pPr>
+      <w:r>
+        <w:rPr>
+          <w:rFonts w:ascii="Times New Roman" w:hAnsi="Times New Roman" w:cs="Times New Roman"/>
+          <w:sz w:val="24"/>
+          <w:szCs w:val="24"/>
+        </w:rPr>
+        <w:t>- Hogar Pobre (Linea de Pobreza LP): CPGI &lt; 1.00 (El ingreso potencial no cubre la CBT).</w:t>
+      </w:r>
+    </w:p>
+    <w:p>
+      <w:pPr>
+        <w:spacing w:before="240" w:after="200"/>
+        <w:jc w:val="both"/>
+        <w:rPr>
+          <w:rFonts w:ascii="Times New Roman" w:hAnsi="Times New Roman" w:cs="Times New Roman"/>
+          <w:sz w:val="24"/>
+          <w:szCs w:val="24"/>
+        </w:rPr>
+      </w:pPr>
+      <w:r>
+        <w:rPr>
+          <w:rFonts w:ascii="Times New Roman" w:hAnsi="Times New Roman" w:cs="Times New Roman"/>
+          <w:sz w:val="24"/>
+          <w:szCs w:val="24"/>
+        </w:rPr>
+        <w:t>- Hogar No Pobre: CPGI &gt;= 1.00 (El ingreso potencial iguala o supera la CBT).</w:t>
+      </w:r>
+    </w:p>
+    <w:p>
+      <w:pPr>
+        <w:spacing w:before="240" w:after="320"/>
+        <w:jc w:val="both"/>
+        <w:rPr>
+          <w:rFonts w:ascii="Times New Roman" w:hAnsi="Times New Roman" w:cs="Times New Roman"/>
+          <w:sz w:val="24"/>
+          <w:szCs w:val="24"/>
+        </w:rPr>
+      </w:pPr>
+      <w:r>
+        <w:rPr>
+          <w:rFonts w:ascii="Times New Roman" w:hAnsi="Times New Roman" w:cs="Times New Roman"/>
+          <w:sz w:val="24"/>
+          <w:szCs w:val="24"/>
+        </w:rPr>
+        <w:t>- Tasa de Vulnerabilidad Hogares (%) = (Hogares con CPGI &lt; 1.00 / Total Hogares Bases SIIS) x 100</w:t>
+      </w:r>
+    </w:p>
+    <w:p>
+      <w:pPr>
+        <w:spacing w:before="280" w:after="200"/>
+        <w:jc w:val="both"/>
+        <w:rPr>
+          <w:rFonts w:ascii="Times New Roman" w:hAnsi="Times New Roman" w:cs="Times New Roman"/>
+          <w:b/>
+          <w:sz w:val="24"/>
+          <w:szCs w:val="24"/>
+        </w:rPr>
+      </w:pPr>
+      <w:r>
+        <w:rPr>
+          <w:rFonts w:ascii="Times New Roman" w:hAnsi="Times New Roman" w:cs="Times New Roman"/>
+          <w:b/>
+          <w:sz w:val="24"/>
+          <w:szCs w:val="24"/>
+        </w:rPr>
+        <w:t>SECCION 2: Ecuaci</w:t>
+      </w:r>
+      <w:r>
+        <w:rPr>
+          <w:rFonts w:ascii="Times New Roman" w:hAnsi="Times New Roman" w:cs="Times New Roman"/>
+          <w:b/>
+          <w:sz w:val="24"/>
+          <w:szCs w:val="24"/>
+        </w:rPr>
+        <w:t>ón Matemá</w:t>
+      </w:r>
+      <w:r>
+        <w:rPr>
+          <w:rFonts w:ascii="Times New Roman" w:hAnsi="Times New Roman" w:cs="Times New Roman"/>
+          <w:b/>
+          <w:sz w:val="24"/>
+          <w:szCs w:val="24"/>
+        </w:rPr>
+        <w:t>tica Ajustada a Bases Administrativas SIIS</w:t>
+      </w:r>
+    </w:p>
+    <w:p>
+      <w:pPr>
+        <w:spacing w:before="280" w:after="200"/>
+        <w:jc w:val="both"/>
+        <w:rPr>
+          <w:rFonts w:ascii="Times New Roman" w:hAnsi="Times New Roman" w:cs="Times New Roman"/>
+          <w:b/>
+          <w:sz w:val="24"/>
+          <w:szCs w:val="24"/>
+        </w:rPr>
+      </w:pPr>
+      <w:r>
+        <w:rPr>
+          <w:rFonts w:ascii="Times New Roman" w:hAnsi="Times New Roman" w:cs="Times New Roman"/>
+          <w:b/>
+          <w:sz w:val="24"/>
+          <w:szCs w:val="24"/>
+        </w:rPr>
+        <w:t>2.1 Ecuació</w:t>
+      </w:r>
+      <w:r>
+        <w:rPr>
+          <w:rFonts w:ascii="Times New Roman" w:hAnsi="Times New Roman" w:cs="Times New Roman"/>
+          <w:b/>
+          <w:sz w:val="24"/>
+          <w:szCs w:val="24"/>
+        </w:rPr>
+        <w:t>n Predictiva (MCO + Lasso)</w:t>
+      </w:r>
+    </w:p>
+    <w:p>
+      <w:pPr>
+        <w:spacing w:before="280" w:after="200"/>
+        <w:jc w:val="both"/>
+        <w:rPr>
+          <w:rFonts w:ascii="Times New Roman" w:hAnsi="Times New Roman" w:cs="Times New Roman"/>
+          <w:sz w:val="24"/>
+          <w:szCs w:val="24"/>
+        </w:rPr>
+      </w:pPr>
+      <w:r>
+        <w:rPr>
+          <w:rFonts w:ascii="Times New Roman" w:hAnsi="Times New Roman" w:cs="Times New Roman"/>
+          <w:sz w:val="24"/>
+          <w:szCs w:val="24"/>
+        </w:rPr>
+        <w:t>ln(CPGI) = b0 + b1*(Cant_personas) + b2*(Jefa_mujer_menores) + b3*</w:t>
+      </w:r>
+      <w:r>
+        <w:rPr>
+          <w:rFonts w:ascii="Times New Roman" w:hAnsi="Times New Roman" w:cs="Times New Roman"/>
+          <w:sz w:val="24"/>
+          <w:szCs w:val="24"/>
+        </w:rPr>
+        <w:t xml:space="preserve"> </w:t>
+      </w:r>
+      <w:r>
+        <w:rPr>
+          <w:rFonts w:ascii="Times New Roman" w:hAnsi="Times New Roman" w:cs="Times New Roman"/>
+          <w:sz w:val="24"/>
+          <w:szCs w:val="24"/>
+        </w:rPr>
+        <w:t>(Jubilados_pensionados) + b4*(Sin_Patrimonio_SINTYS) + b5*(Cat_Monotributo_ARCA) + b6*(Tasa_dependencia) + b7*(Tasa_menores) + b8*</w:t>
+      </w:r>
+      <w:r>
+        <w:rPr>
+          <w:rFonts w:ascii="Times New Roman" w:hAnsi="Times New Roman" w:cs="Times New Roman"/>
+          <w:sz w:val="24"/>
+          <w:szCs w:val="24"/>
+        </w:rPr>
+        <w:t xml:space="preserve"> </w:t>
+      </w:r>
+      <w:r>
+        <w:rPr>
+          <w:rFonts w:ascii="Times New Roman" w:hAnsi="Times New Roman" w:cs="Times New Roman"/>
+          <w:sz w:val="24"/>
+          <w:szCs w:val="24"/>
+        </w:rPr>
+        <w:t>(Monto_Adicional_ANSES) + b9*</w:t>
+      </w:r>
+      <w:r>
+        <w:rPr>
+          <w:rFonts w:ascii="Times New Roman" w:hAnsi="Times New Roman" w:cs="Times New Roman"/>
+          <w:sz w:val="24"/>
+          <w:szCs w:val="24"/>
+        </w:rPr>
+        <w:t xml:space="preserve"> </w:t>
+      </w:r>
+      <w:r>
+        <w:rPr>
+          <w:rFonts w:ascii="Times New Roman" w:hAnsi="Times New Roman" w:cs="Times New Roman"/>
+          <w:sz w:val="24"/>
+          <w:szCs w:val="24"/>
+        </w:rPr>
+        <w:t>(Asalariados_registrados) + b10*</w:t>
+      </w:r>
+      <w:r>
+        <w:rPr>
+          <w:rFonts w:ascii="Times New Roman" w:hAnsi="Times New Roman" w:cs="Times New Roman"/>
+          <w:sz w:val="24"/>
+          <w:szCs w:val="24"/>
+        </w:rPr>
+        <w:t xml:space="preserve"> </w:t>
+      </w:r>
+      <w:r>
+        <w:rPr>
+          <w:rFonts w:ascii="Times New Roman" w:hAnsi="Times New Roman" w:cs="Times New Roman"/>
+          <w:sz w:val="24"/>
+          <w:szCs w:val="24"/>
+        </w:rPr>
+        <w:t>(Clima_educativo^2) + b11*</w:t>
+      </w:r>
+      <w:r>
+        <w:rPr>
+          <w:rFonts w:ascii="Times New Roman" w:hAnsi="Times New Roman" w:cs="Times New Roman"/>
+          <w:sz w:val="24"/>
+          <w:szCs w:val="24"/>
+        </w:rPr>
+        <w:t xml:space="preserve"> </w:t>
+      </w:r>
+      <w:r>
+        <w:rPr>
+          <w:rFonts w:ascii="Times New Roman" w:hAnsi="Times New Roman" w:cs="Times New Roman"/>
+          <w:sz w:val="24"/>
+          <w:szCs w:val="24"/>
+        </w:rPr>
+        <w:t>(Jefe_superior_completo) + b12*</w:t>
+      </w:r>
+      <w:r>
+        <w:rPr>
+          <w:rFonts w:ascii="Times New Roman" w:hAnsi="Times New Roman" w:cs="Times New Roman"/>
+          <w:sz w:val="24"/>
+          <w:szCs w:val="24"/>
+        </w:rPr>
+        <w:t xml:space="preserve"> </w:t>
+      </w:r>
+      <w:r>
+        <w:rPr>
+          <w:rFonts w:ascii="Times New Roman" w:hAnsi="Times New Roman" w:cs="Times New Roman"/>
+          <w:sz w:val="24"/>
+          <w:szCs w:val="24"/>
+        </w:rPr>
+        <w:t>(Edad_jefe) + b13*(Ingreso_real_medio_provincial)</w:t>
+      </w:r>
+    </w:p>
+    <w:p>
+      <w:pPr>
+        <w:spacing w:before="280" w:after="200"/>
+        <w:jc w:val="both"/>
+        <w:rPr>
+          <w:rFonts w:ascii="Times New Roman" w:hAnsi="Times New Roman" w:cs="Times New Roman"/>
+          <w:b/>
+          <w:sz w:val="24"/>
+          <w:szCs w:val="24"/>
+        </w:rPr>
+      </w:pPr>
+      <w:r>
+        <w:rPr>
+          <w:rFonts w:ascii="Times New Roman" w:hAnsi="Times New Roman" w:cs="Times New Roman"/>
+          <w:b/>
+          <w:sz w:val="24"/>
+          <w:szCs w:val="24"/>
+        </w:rPr>
+        <w:t xml:space="preserve">2.2 Sustitucion de </w:t>
+      </w:r>
+      <w:r>
+        <w:rPr>
+          <w:rFonts w:ascii="Times New Roman" w:hAnsi="Times New Roman" w:cs="Times New Roman"/>
+          <w:b/>
+          <w:sz w:val="24"/>
+          <w:szCs w:val="24"/>
+        </w:rPr>
+        <w:t xml:space="preserve">variables de vivienda </w:t>
+      </w:r>
+      <w:r>
+        <w:rPr>
+          <w:rFonts w:ascii="Times New Roman" w:hAnsi="Times New Roman" w:cs="Times New Roman"/>
+          <w:b/>
+          <w:sz w:val="24"/>
+          <w:szCs w:val="24"/>
+        </w:rPr>
+        <w:t xml:space="preserve">EPH por </w:t>
+      </w:r>
+      <w:r>
+        <w:rPr>
+          <w:rFonts w:ascii="Times New Roman" w:hAnsi="Times New Roman" w:cs="Times New Roman"/>
+          <w:b/>
+          <w:sz w:val="24"/>
+          <w:szCs w:val="24"/>
+        </w:rPr>
+        <w:t>registros administrativos</w:t>
+      </w:r>
+    </w:p>
+    <w:p>
+      <w:pPr>
+        <w:spacing w:before="280" w:after="200"/>
+        <w:jc w:val="both"/>
+        <w:rPr>
+          <w:rFonts w:ascii="Times New Roman" w:hAnsi="Times New Roman" w:cs="Times New Roman"/>
+          <w:sz w:val="24"/>
+          <w:szCs w:val="24"/>
+        </w:rPr>
+      </w:pPr>
+      <w:r>
+        <w:rPr>
+          <w:rFonts w:ascii="Times New Roman" w:hAnsi="Times New Roman" w:cs="Times New Roman"/>
+          <w:sz w:val="24"/>
+          <w:szCs w:val="24"/>
+        </w:rPr>
+        <w:t>Para operar 100% con bases administrativas sin dependencia de encuestas EPH, se removieron las variables habitacionales (Saneamiento_deficiente, Tenencia_regular, Piso_precario, Techo_precario) y se incorporaron tres variables de registros administrativos SIIS:</w:t>
+      </w:r>
+    </w:p>
+    <w:p>
+      <w:pPr>
+        <w:spacing w:before="280" w:after="200"/>
+        <w:jc w:val="both"/>
+        <w:rPr>
+          <w:rFonts w:ascii="Times New Roman" w:hAnsi="Times New Roman" w:cs="Times New Roman"/>
+          <w:sz w:val="24"/>
+          <w:szCs w:val="24"/>
+        </w:rPr>
+      </w:pPr>
+      <w:r>
+        <w:rPr>
+          <w:rFonts w:ascii="Times New Roman" w:hAnsi="Times New Roman" w:cs="Times New Roman"/>
+          <w:sz w:val="24"/>
+          <w:szCs w:val="24"/>
+        </w:rPr>
+        <w:t>1. Sin_Patrimonio_SINTYS (SINTyS): Ausencia de bienes registrables (inmuebles y automotores 0 a 3 anos de antiguedad).</w:t>
+      </w:r>
+    </w:p>
+    <w:p>
+      <w:pPr>
+        <w:spacing w:before="280" w:after="200"/>
+        <w:jc w:val="both"/>
+        <w:rPr>
+          <w:rFonts w:ascii="Times New Roman" w:hAnsi="Times New Roman" w:cs="Times New Roman"/>
+          <w:sz w:val="24"/>
+          <w:szCs w:val="24"/>
+        </w:rPr>
+      </w:pPr>
+      <w:r>
+        <w:rPr>
+          <w:rFonts w:ascii="Times New Roman" w:hAnsi="Times New Roman" w:cs="Times New Roman"/>
+          <w:sz w:val="24"/>
+          <w:szCs w:val="24"/>
+        </w:rPr>
+        <w:t>2. Cat_Monotributo_ARCA (ARCA): Categoria contributiva del monotributista (A a L) o regimen de autonomos.</w:t>
+      </w:r>
+    </w:p>
+    <w:p>
+      <w:pPr>
+        <w:spacing w:before="280" w:after="320"/>
+        <w:jc w:val="both"/>
+        <w:rPr>
+          <w:rFonts w:ascii="Times New Roman" w:hAnsi="Times New Roman" w:cs="Times New Roman"/>
+          <w:sz w:val="24"/>
+          <w:szCs w:val="24"/>
+        </w:rPr>
+      </w:pPr>
+      <w:r>
+        <w:rPr>
+          <w:rFonts w:ascii="Times New Roman" w:hAnsi="Times New Roman" w:cs="Times New Roman"/>
+          <w:sz w:val="24"/>
+          <w:szCs w:val="24"/>
+        </w:rPr>
+        <w:t>3. Monto_Adicional_ANSES (ANSES): Adicionales liquidados por prestaciones de AUH/AUD o Asignaciones Familiares (Monto_Adicional_Vl).</w:t>
+      </w:r>
+    </w:p>
+    <w:p>
+      <w:pPr>
+        <w:spacing w:before="280" w:after="200"/>
+        <w:jc w:val="both"/>
+        <w:rPr>
+          <w:rFonts w:ascii="Times New Roman" w:hAnsi="Times New Roman" w:cs="Times New Roman"/>
+          <w:b/>
+          <w:sz w:val="24"/>
+          <w:szCs w:val="24"/>
+        </w:rPr>
+      </w:pPr>
+      <w:r>
+        <w:rPr>
+          <w:rFonts w:ascii="Times New Roman" w:hAnsi="Times New Roman" w:cs="Times New Roman"/>
+          <w:b/>
+          <w:sz w:val="24"/>
+          <w:szCs w:val="24"/>
+        </w:rPr>
+        <w:lastRenderedPageBreak/>
+        <w:t xml:space="preserve">SECCION 3: Calculo </w:t>
+      </w:r>
+      <w:r>
+        <w:rPr>
+          <w:rFonts w:ascii="Times New Roman" w:hAnsi="Times New Roman" w:cs="Times New Roman"/>
+          <w:b/>
+          <w:sz w:val="24"/>
+          <w:szCs w:val="24"/>
+        </w:rPr>
+        <w:t>paso a paso y simulacion de casos ficticios</w:t>
+      </w:r>
+    </w:p>
+    <w:p>
+      <w:pPr>
+        <w:spacing w:before="280" w:after="200"/>
+        <w:jc w:val="both"/>
+        <w:rPr>
+          <w:rFonts w:ascii="Times New Roman" w:hAnsi="Times New Roman" w:cs="Times New Roman"/>
+          <w:sz w:val="24"/>
+          <w:szCs w:val="24"/>
+        </w:rPr>
+      </w:pPr>
+      <w:r>
+        <w:rPr>
+          <w:rFonts w:ascii="Times New Roman" w:hAnsi="Times New Roman" w:cs="Times New Roman"/>
+          <w:sz w:val="24"/>
+          <w:szCs w:val="24"/>
+        </w:rPr>
+        <w:t>Parametros de Ejemplo Calibrados:</w:t>
+      </w:r>
+    </w:p>
+    <w:p>
+      <w:pPr>
+        <w:spacing w:before="280" w:after="200"/>
+        <w:jc w:val="both"/>
+        <w:rPr>
+          <w:rFonts w:ascii="Times New Roman" w:hAnsi="Times New Roman" w:cs="Times New Roman"/>
+          <w:sz w:val="24"/>
+          <w:szCs w:val="24"/>
+        </w:rPr>
+      </w:pPr>
+      <w:r>
+        <w:rPr>
+          <w:rFonts w:ascii="Times New Roman" w:hAnsi="Times New Roman" w:cs="Times New Roman"/>
+          <w:sz w:val="24"/>
+          <w:szCs w:val="24"/>
+        </w:rPr>
+        <w:t>b0 = -0.35 | b1 = -0.08 | b2 = -0.25 | b3 = +0.20 | b4 = -0.15 | b5 = +0.05 | b6 = -0.15 | b7 = -0.10 | b8 = +0.12 | b9 = +0.35 | b10 = +0.002 | b11 = +0.30 | b12 = +0.005</w:t>
+      </w:r>
+    </w:p>
+    <w:p>
+      <w:pPr>
+        <w:spacing w:before="280" w:after="200"/>
+        <w:jc w:val="both"/>
+        <w:rPr>
+          <w:rFonts w:ascii="Times New Roman" w:hAnsi="Times New Roman" w:cs="Times New Roman"/>
+          <w:b/>
+          <w:sz w:val="24"/>
+          <w:szCs w:val="24"/>
+        </w:rPr>
+      </w:pPr>
+      <w:r>
+        <w:rPr>
+          <w:rFonts w:ascii="Times New Roman" w:hAnsi="Times New Roman" w:cs="Times New Roman"/>
+          <w:b/>
+          <w:sz w:val="24"/>
+          <w:szCs w:val="24"/>
+        </w:rPr>
+        <w:t xml:space="preserve">CASO A: Hogar en </w:t>
+      </w:r>
+      <w:r>
+        <w:rPr>
+          <w:rFonts w:ascii="Times New Roman" w:hAnsi="Times New Roman" w:cs="Times New Roman"/>
+          <w:b/>
+          <w:sz w:val="24"/>
+          <w:szCs w:val="24"/>
+        </w:rPr>
+        <w:t>i</w:t>
+      </w:r>
+      <w:r>
+        <w:rPr>
+          <w:rFonts w:ascii="Times New Roman" w:hAnsi="Times New Roman" w:cs="Times New Roman"/>
+          <w:b/>
+          <w:sz w:val="24"/>
+          <w:szCs w:val="24"/>
+        </w:rPr>
+        <w:t xml:space="preserve">ndigencia </w:t>
+      </w:r>
+      <w:r>
+        <w:rPr>
+          <w:rFonts w:ascii="Times New Roman" w:hAnsi="Times New Roman" w:cs="Times New Roman"/>
+          <w:b/>
+          <w:sz w:val="24"/>
+          <w:szCs w:val="24"/>
+        </w:rPr>
+        <w:t>e</w:t>
+      </w:r>
+      <w:r>
+        <w:rPr>
+          <w:rFonts w:ascii="Times New Roman" w:hAnsi="Times New Roman" w:cs="Times New Roman"/>
+          <w:b/>
+          <w:sz w:val="24"/>
+          <w:szCs w:val="24"/>
+        </w:rPr>
+        <w:t>xtrema</w:t>
+      </w:r>
+    </w:p>
+    <w:p>
+      <w:pPr>
+        <w:spacing w:before="280" w:after="200"/>
+        <w:jc w:val="both"/>
+        <w:rPr>
+          <w:rFonts w:ascii="Times New Roman" w:hAnsi="Times New Roman" w:cs="Times New Roman"/>
+          <w:sz w:val="24"/>
+          <w:szCs w:val="24"/>
+        </w:rPr>
+      </w:pPr>
+      <w:r>
+        <w:rPr>
+          <w:rFonts w:ascii="Times New Roman" w:hAnsi="Times New Roman" w:cs="Times New Roman"/>
+          <w:sz w:val="24"/>
+          <w:szCs w:val="24"/>
+        </w:rPr>
+        <w:t>- Madre soltera (32 anos) con 3 hijos (4 integrantes en La Matanza). Sin empleo registrado en ARCA/STESS. Cobrando AUH + Adicional en ANSES. Sin bienes en SINTyS. Clima educativo de 8 anos.</w:t>
+      </w:r>
+    </w:p>
+    <w:p>
+      <w:pPr>
+        <w:spacing w:before="280" w:after="200"/>
+        <w:jc w:val="both"/>
+        <w:rPr>
+          <w:rFonts w:ascii="Times New Roman" w:hAnsi="Times New Roman" w:cs="Times New Roman"/>
+          <w:sz w:val="24"/>
+          <w:szCs w:val="24"/>
+        </w:rPr>
+      </w:pPr>
+      <w:r>
+        <w:rPr>
+          <w:rFonts w:ascii="Times New Roman" w:hAnsi="Times New Roman" w:cs="Times New Roman"/>
+          <w:sz w:val="24"/>
+          <w:szCs w:val="24"/>
+        </w:rPr>
+        <w:t>Calculo:</w:t>
+      </w:r>
+    </w:p>
+    <w:p>
+      <w:pPr>
+        <w:spacing w:before="280" w:after="200"/>
+        <w:jc w:val="both"/>
+        <w:rPr>
+          <w:rFonts w:ascii="Times New Roman" w:hAnsi="Times New Roman" w:cs="Times New Roman"/>
+          <w:sz w:val="24"/>
+          <w:szCs w:val="24"/>
+        </w:rPr>
+      </w:pPr>
+      <w:r>
+        <w:rPr>
+          <w:rFonts w:ascii="Times New Roman" w:hAnsi="Times New Roman" w:cs="Times New Roman"/>
+          <w:sz w:val="24"/>
+          <w:szCs w:val="24"/>
+        </w:rPr>
+        <w:t>ln(CPGI) = -0.35 - 0.32 - 0.25 - 0.15 - 0.11 - 0.08 + 0.12 + 0.13 + 0.16 = -0.85</w:t>
+      </w:r>
+    </w:p>
+    <w:p>
+      <w:pPr>
+        <w:spacing w:before="280" w:after="200"/>
+        <w:jc w:val="both"/>
+        <w:rPr>
+          <w:rFonts w:ascii="Times New Roman" w:hAnsi="Times New Roman" w:cs="Times New Roman"/>
+          <w:sz w:val="24"/>
+          <w:szCs w:val="24"/>
+        </w:rPr>
+      </w:pPr>
+      <w:r>
+        <w:rPr>
+          <w:rFonts w:ascii="Times New Roman" w:hAnsi="Times New Roman" w:cs="Times New Roman"/>
+          <w:sz w:val="24"/>
+          <w:szCs w:val="24"/>
+        </w:rPr>
+        <w:t>CPGI = exp(-0.85) = 0.43</w:t>
+      </w:r>
+    </w:p>
+    <w:p>
+      <w:pPr>
+        <w:spacing w:before="280" w:after="200"/>
+        <w:jc w:val="both"/>
+        <w:rPr>
+          <w:rFonts w:ascii="Times New Roman" w:hAnsi="Times New Roman" w:cs="Times New Roman"/>
+          <w:sz w:val="24"/>
+          <w:szCs w:val="24"/>
+        </w:rPr>
+      </w:pPr>
+      <w:r>
+        <w:rPr>
+          <w:rFonts w:ascii="Times New Roman" w:hAnsi="Times New Roman" w:cs="Times New Roman"/>
+          <w:sz w:val="24"/>
+          <w:szCs w:val="24"/>
+        </w:rPr>
+        <w:t>Resultado Caso A: CPGI = 0.43 (&lt; 1.00). El ingreso potencial del hogar solo cubre el 43% de la Canasta Basica Total (CBT), clasificando como Indigencia Extrema.</w:t>
+      </w:r>
+    </w:p>
+    <w:p>
+      <w:pPr>
+        <w:spacing w:before="280" w:after="200"/>
+        <w:jc w:val="both"/>
+        <w:rPr>
+          <w:rFonts w:ascii="Times New Roman" w:hAnsi="Times New Roman" w:cs="Times New Roman"/>
+          <w:b/>
+          <w:sz w:val="24"/>
+          <w:szCs w:val="24"/>
+        </w:rPr>
+      </w:pPr>
+      <w:r>
+        <w:rPr>
+          <w:rFonts w:ascii="Times New Roman" w:hAnsi="Times New Roman" w:cs="Times New Roman"/>
+          <w:b/>
+          <w:sz w:val="24"/>
+          <w:szCs w:val="24"/>
+        </w:rPr>
+        <w:t xml:space="preserve">CASO B: Hogar </w:t>
+      </w:r>
+      <w:r>
+        <w:rPr>
+          <w:rFonts w:ascii="Times New Roman" w:hAnsi="Times New Roman" w:cs="Times New Roman"/>
+          <w:b/>
+          <w:sz w:val="24"/>
+          <w:szCs w:val="24"/>
+        </w:rPr>
+        <w:t>formal estabilizado</w:t>
       </w:r>
     </w:p>
     <w:p>
@@ -723,6 +947,7 @@
               <w:jc w:val="both"/>
               <w:rPr>
                 <w:rFonts w:ascii="Times New Roman" w:hAnsi="Times New Roman" w:cs="Times New Roman"/>
+                <w:b/>
                 <w:sz w:val="24"/>
                 <w:szCs w:val="24"/>
               </w:rPr>
@@ -730,6 +955,7 @@
             <w:r>
               <w:rPr>
                 <w:rFonts w:ascii="Times New Roman" w:hAnsi="Times New Roman" w:cs="Times New Roman"/>
+                <w:b/>
                 <w:sz w:val="24"/>
                 <w:szCs w:val="24"/>
               </w:rPr>
@@ -748,6 +974,7 @@
               <w:jc w:val="both"/>
               <w:rPr>
                 <w:rFonts w:ascii="Times New Roman" w:hAnsi="Times New Roman" w:cs="Times New Roman"/>
+                <w:b/>
                 <w:sz w:val="24"/>
                 <w:szCs w:val="24"/>
               </w:rPr>
@@ -755,6 +982,7 @@
             <w:r>
               <w:rPr>
                 <w:rFonts w:ascii="Times New Roman" w:hAnsi="Times New Roman" w:cs="Times New Roman"/>
+                <w:b/>
                 <w:sz w:val="24"/>
                 <w:szCs w:val="24"/>
               </w:rPr>
@@ -773,6 +1001,7 @@
               <w:jc w:val="both"/>
               <w:rPr>
                 <w:rFonts w:ascii="Times New Roman" w:hAnsi="Times New Roman" w:cs="Times New Roman"/>
+                <w:b/>
                 <w:sz w:val="24"/>
                 <w:szCs w:val="24"/>
               </w:rPr>
@@ -780,6 +1009,7 @@
             <w:r>
               <w:rPr>
                 <w:rFonts w:ascii="Times New Roman" w:hAnsi="Times New Roman" w:cs="Times New Roman"/>
+                <w:b/>
                 <w:sz w:val="24"/>
                 <w:szCs w:val="24"/>
               </w:rPr>
@@ -798,6 +1028,7 @@
               <w:jc w:val="both"/>
               <w:rPr>
                 <w:rFonts w:ascii="Times New Roman" w:hAnsi="Times New Roman" w:cs="Times New Roman"/>
+                <w:b/>
                 <w:sz w:val="24"/>
                 <w:szCs w:val="24"/>
               </w:rPr>
@@ -805,6 +1036,7 @@
             <w:r>
               <w:rPr>
                 <w:rFonts w:ascii="Times New Roman" w:hAnsi="Times New Roman" w:cs="Times New Roman"/>
+                <w:b/>
                 <w:sz w:val="24"/>
                 <w:szCs w:val="24"/>
               </w:rPr>
@@ -937,7 +1169,6 @@
                 <w:sz w:val="24"/>
                 <w:szCs w:val="24"/>
               </w:rPr>
-              <w:lastRenderedPageBreak/>
               <w:t>0.50 &lt;= CPGI &lt; 1.00</w:t>
             </w:r>
           </w:p>
@@ -1040,6 +1271,7 @@
                 <w:sz w:val="24"/>
                 <w:szCs w:val="24"/>
               </w:rPr>
+              <w:lastRenderedPageBreak/>
               <w:t>CPGI = 1.00</w:t>
             </w:r>
           </w:p>
@@ -1327,18 +1559,18 @@
     </w:tbl>
     <w:p>
       <w:pPr>
-        <w:spacing w:before="280" w:after="200"/>
-        <w:jc w:val="both"/>
-        <w:rPr>
-          <w:rFonts w:ascii="Times New Roman" w:hAnsi="Times New Roman" w:cs="Times New Roman"/>
-          <w:sz w:val="24"/>
-          <w:szCs w:val="24"/>
-        </w:rPr>
-      </w:pPr>
-    </w:p>
-    <w:p>
-      <w:pPr>
-        <w:spacing w:before="280" w:after="200"/>
+        <w:spacing w:after="0" w:line="276" w:lineRule="auto"/>
+        <w:jc w:val="both"/>
+        <w:rPr>
+          <w:rFonts w:ascii="Times New Roman" w:hAnsi="Times New Roman" w:cs="Times New Roman"/>
+          <w:sz w:val="24"/>
+          <w:szCs w:val="24"/>
+        </w:rPr>
+      </w:pPr>
+    </w:p>
+    <w:p>
+      <w:pPr>
+        <w:spacing w:after="0" w:line="276" w:lineRule="auto"/>
         <w:jc w:val="both"/>
         <w:rPr>
           <w:rFonts w:ascii="Times New Roman" w:hAnsi="Times New Roman" w:cs="Times New Roman"/>
@@ -1357,21 +1589,21 @@
     </w:p>
     <w:p>
       <w:pPr>
-        <w:spacing w:before="280" w:after="120"/>
-        <w:jc w:val="both"/>
-        <w:rPr>
-          <w:rFonts w:ascii="Times New Roman" w:hAnsi="Times New Roman" w:cs="Times New Roman"/>
-          <w:sz w:val="24"/>
-          <w:szCs w:val="24"/>
-        </w:rPr>
-      </w:pPr>
-      <w:r>
-        <w:rPr>
-          <w:rFonts w:ascii="Times New Roman" w:hAnsi="Times New Roman" w:cs="Times New Roman"/>
-          <w:sz w:val="24"/>
-          <w:szCs w:val="24"/>
-        </w:rPr>
-        <w:t>Ministerio de Capital Humano - Secretaria de Primera Infancia (Julio 2026).</w:t>
+        <w:spacing w:after="0" w:line="276" w:lineRule="auto"/>
+        <w:jc w:val="both"/>
+        <w:rPr>
+          <w:rFonts w:ascii="Times New Roman" w:hAnsi="Times New Roman" w:cs="Times New Roman"/>
+          <w:sz w:val="24"/>
+          <w:szCs w:val="24"/>
+        </w:rPr>
+      </w:pPr>
+      <w:r>
+        <w:rPr>
+          <w:rFonts w:ascii="Times New Roman" w:hAnsi="Times New Roman" w:cs="Times New Roman"/>
+          <w:sz w:val="24"/>
+          <w:szCs w:val="24"/>
+        </w:rPr>
+        <w:t>Ministerio de Capital Humano -  (Julio 2026).</w:t>
       </w:r>
     </w:p>
     <w:p>
@@ -1388,7 +1620,7 @@
     </w:p>
     <w:sectPr>
       <w:pgSz w:w="11906" w:h="16838"/>
-      <w:pgMar w:top="1134" w:right="1274" w:bottom="1134" w:left="1417" w:header="708" w:footer="708" w:gutter="0"/>
+      <w:pgMar w:top="1134" w:right="991" w:bottom="1134" w:left="1417" w:header="708" w:footer="708" w:gutter="0"/>
       <w:cols w:space="708"/>
       <w:docGrid w:linePitch="360"/>
     </w:sectPr>

</xml_diff>